<commit_message>
Sync ai-ops-boilerplate: design journal updated (distribution + portal login)
</commit_message>
<xml_diff>
--- a/ai-ops-boilerplate/docs/_harness/DESIGN_DECISIONS.docx
+++ b/ai-ops-boilerplate/docs/_harness/DESIGN_DECISIONS.docx
@@ -4572,50 +4572,15 @@
     </w:p>
     <w:p>
       <w:pPr>
-        <w:spacing w:before="280" w:after="80"/>
-        <w:pBdr>
-          <w:bottom w:val="single" w:sz="6" w:space="1" w:color="DFE1E6"/>
-        </w:pBdr>
+        <w:spacing w:before="160" w:after="80"/>
       </w:pPr>
       <w:r>
         <w:rPr>
           <w:b/>
           <w:color w:val="172B4D"/>
-          <w:sz w:val="32"/>
-        </w:rPr>
-        <w:t>5. Decisions we reversed — and why</w:t>
-      </w:r>
-    </w:p>
-    <w:p>
-      <w:pPr>
-        <w:spacing w:after="120"/>
-      </w:pPr>
-      <w:r>
-        <w:rPr>
-          <w:b w:val="0"/>
-          <w:i w:val="0"/>
-          <w:color w:val="172B4D"/>
-          <w:sz w:val="21"/>
-        </w:rPr>
-        <w:t xml:space="preserve">Honest record of the thinking, because the reversals </w:t>
-      </w:r>
-      <w:r>
-        <w:rPr>
-          <w:b w:val="0"/>
-          <w:i/>
-          <w:color w:val="626F86"/>
-          <w:sz w:val="21"/>
-        </w:rPr>
-        <w:t>are</w:t>
-      </w:r>
-      <w:r>
-        <w:rPr>
-          <w:b w:val="0"/>
-          <w:i w:val="0"/>
-          <w:color w:val="172B4D"/>
-          <w:sz w:val="21"/>
-        </w:rPr>
-        <w:t xml:space="preserve"> the design process.</w:t>
+          <w:sz w:val="25"/>
+        </w:rPr>
+        <w:t>4.8 Distribution — a GitHub template + two READMEs</w:t>
       </w:r>
     </w:p>
     <w:p>
@@ -4630,56 +4595,16 @@
           <w:color w:val="172B4D"/>
           <w:sz w:val="21"/>
         </w:rPr>
-        <w:t>Two scaffolds → one spine.</w:t>
-      </w:r>
-      <w:r>
-        <w:rPr>
-          <w:b w:val="0"/>
-          <w:i w:val="0"/>
-          <w:color w:val="172B4D"/>
-          <w:sz w:val="21"/>
-        </w:rPr>
-        <w:t xml:space="preserve"> Initially planned </w:t>
-      </w:r>
-      <w:r>
-        <w:rPr>
-          <w:rFonts w:ascii="Consolas" w:hAnsi="Consolas"/>
-          <w:b w:val="0"/>
-          <w:i w:val="0"/>
-          <w:color w:val="40302A"/>
-          <w:sz w:val="19"/>
-          <w:shd w:val="clear" w:fill="F4F5F7"/>
-        </w:rPr>
-        <w:t>simple</w:t>
-      </w:r>
-      <w:r>
-        <w:rPr>
-          <w:b w:val="0"/>
-          <w:i w:val="0"/>
-          <w:color w:val="172B4D"/>
-          <w:sz w:val="21"/>
-        </w:rPr>
-        <w:t xml:space="preserve"> + </w:t>
-      </w:r>
-      <w:r>
-        <w:rPr>
-          <w:rFonts w:ascii="Consolas" w:hAnsi="Consolas"/>
-          <w:b w:val="0"/>
-          <w:i w:val="0"/>
-          <w:color w:val="40302A"/>
-          <w:sz w:val="19"/>
-          <w:shd w:val="clear" w:fill="F4F5F7"/>
-        </w:rPr>
-        <w:t>orchestrated</w:t>
-      </w:r>
-      <w:r>
-        <w:rPr>
-          <w:b w:val="0"/>
-          <w:i w:val="0"/>
-          <w:color w:val="172B4D"/>
-          <w:sz w:val="21"/>
-        </w:rPr>
-        <w:t xml:space="preserve"> scaffolds.</w:t>
+        <w:t>Context.</w:t>
+      </w:r>
+      <w:r>
+        <w:rPr>
+          <w:b w:val="0"/>
+          <w:i w:val="0"/>
+          <w:color w:val="172B4D"/>
+          <w:sz w:val="21"/>
+        </w:rPr>
+        <w:t xml:space="preserve"> The asset has to be adopted by other teams with minimal friction, and each</w:t>
       </w:r>
     </w:p>
     <w:p>
@@ -4693,7 +4618,7 @@
           <w:color w:val="172B4D"/>
           <w:sz w:val="21"/>
         </w:rPr>
-        <w:t>Reversed to a single spine with the engine opt-in, to avoid two divergent structures to maintain (§4.2).</w:t>
+        <w:t>adoption must start a clean, self-contained automation repo.</w:t>
       </w:r>
     </w:p>
     <w:p>
@@ -4708,16 +4633,25 @@
           <w:color w:val="172B4D"/>
           <w:sz w:val="21"/>
         </w:rPr>
-        <w:t>Vendored core was challenged.</w:t>
-      </w:r>
-      <w:r>
-        <w:rPr>
-          <w:b w:val="0"/>
-          <w:i w:val="0"/>
-          <w:color w:val="172B4D"/>
-          <w:sz w:val="21"/>
-        </w:rPr>
-        <w:t xml:space="preserve"> An independent critique argued for a versioned,</w:t>
+        <w:t>Decision.</w:t>
+      </w:r>
+      <w:r>
+        <w:rPr>
+          <w:b w:val="0"/>
+          <w:i w:val="0"/>
+          <w:color w:val="172B4D"/>
+          <w:sz w:val="21"/>
+        </w:rPr>
+        <w:t xml:space="preserve"> Ship the harness as a </w:t>
+      </w:r>
+      <w:r>
+        <w:rPr>
+          <w:b/>
+          <w:i w:val="0"/>
+          <w:color w:val="172B4D"/>
+          <w:sz w:val="21"/>
+        </w:rPr>
+        <w:t>published GitHub template repo</w:t>
       </w:r>
     </w:p>
     <w:p>
@@ -4731,7 +4665,7 @@
           <w:color w:val="172B4D"/>
           <w:sz w:val="21"/>
         </w:rPr>
-        <w:t xml:space="preserve">installable </w:t>
+        <w:t>(</w:t>
       </w:r>
       <w:r>
         <w:rPr>
@@ -4742,16 +4676,16 @@
           <w:sz w:val="19"/>
           <w:shd w:val="clear" w:fill="F4F5F7"/>
         </w:rPr>
-        <w:t>wsa-core</w:t>
-      </w:r>
-      <w:r>
-        <w:rPr>
-          <w:b w:val="0"/>
-          <w:i w:val="0"/>
-          <w:color w:val="172B4D"/>
-          <w:sz w:val="21"/>
-        </w:rPr>
-        <w:t xml:space="preserve"> package pinned per repo instead of vendoring, plus </w:t>
+        <w:t>314495_ai-ops-harness-swat</w:t>
+      </w:r>
+      <w:r>
+        <w:rPr>
+          <w:b w:val="0"/>
+          <w:i w:val="0"/>
+          <w:color w:val="172B4D"/>
+          <w:sz w:val="21"/>
+        </w:rPr>
+        <w:t xml:space="preserve">, "Use this template" enabled). Because GitHub copies </w:t>
       </w:r>
       <w:r>
         <w:rPr>
@@ -4762,34 +4696,16 @@
           <w:sz w:val="19"/>
           <w:shd w:val="clear" w:fill="F4F5F7"/>
         </w:rPr>
-        <w:t>copier</w:t>
-      </w:r>
-      <w:r>
-        <w:rPr>
-          <w:b w:val="0"/>
-          <w:i w:val="0"/>
-          <w:color w:val="172B4D"/>
-          <w:sz w:val="21"/>
-        </w:rPr>
-        <w:t xml:space="preserve"> for the shell. We kept </w:t>
-      </w:r>
-      <w:r>
-        <w:rPr>
-          <w:b/>
-          <w:i w:val="0"/>
-          <w:color w:val="172B4D"/>
-          <w:sz w:val="21"/>
-        </w:rPr>
-        <w:t>vendoring</w:t>
-      </w:r>
-      <w:r>
-        <w:rPr>
-          <w:b w:val="0"/>
-          <w:i w:val="0"/>
-          <w:color w:val="172B4D"/>
-          <w:sz w:val="21"/>
-        </w:rPr>
-        <w:t xml:space="preserve"> (it fits the self-contained, client-isolated, laptop- runnable model) but adopted the critique's real point: </w:t>
+        <w:t>README.md</w:t>
+      </w:r>
+      <w:r>
+        <w:rPr>
+          <w:b w:val="0"/>
+          <w:i w:val="0"/>
+          <w:color w:val="172B4D"/>
+          <w:sz w:val="21"/>
+        </w:rPr>
+        <w:t xml:space="preserve"> verbatim into every generated repo, split the READMEs by audience: the landing </w:t>
       </w:r>
       <w:r>
         <w:rPr>
@@ -4800,16 +4716,16 @@
           <w:sz w:val="19"/>
           <w:shd w:val="clear" w:fill="F4F5F7"/>
         </w:rPr>
-        <w:t>copier update</w:t>
-      </w:r>
-      <w:r>
-        <w:rPr>
-          <w:b w:val="0"/>
-          <w:i w:val="0"/>
-          <w:color w:val="172B4D"/>
-          <w:sz w:val="21"/>
-        </w:rPr>
-        <w:t xml:space="preserve"> is the eventual answer to vendored-core drift. Copier is </w:t>
+        <w:t>README.md</w:t>
+      </w:r>
+      <w:r>
+        <w:rPr>
+          <w:b w:val="0"/>
+          <w:i w:val="0"/>
+          <w:color w:val="172B4D"/>
+          <w:sz w:val="21"/>
+        </w:rPr>
+        <w:t xml:space="preserve"> is the </w:t>
       </w:r>
       <w:r>
         <w:rPr>
@@ -4818,16 +4734,94 @@
           <w:color w:val="172B4D"/>
           <w:sz w:val="21"/>
         </w:rPr>
-        <w:t>deferred</w:t>
-      </w:r>
-      <w:r>
-        <w:rPr>
-          <w:b w:val="0"/>
-          <w:i w:val="0"/>
-          <w:color w:val="172B4D"/>
-          <w:sz w:val="21"/>
-        </w:rPr>
-        <w:t>, not rejected.</w:t>
+        <w:t>harness page</w:t>
+      </w:r>
+      <w:r>
+        <w:rPr>
+          <w:b w:val="0"/>
+          <w:i w:val="0"/>
+          <w:color w:val="172B4D"/>
+          <w:sz w:val="21"/>
+        </w:rPr>
+        <w:t xml:space="preserve"> (for a developer evaluating the template); the clean operator/build run-guide ships as </w:t>
+      </w:r>
+      <w:r>
+        <w:rPr>
+          <w:rFonts w:ascii="Consolas" w:hAnsi="Consolas"/>
+          <w:b w:val="0"/>
+          <w:i w:val="0"/>
+          <w:color w:val="40302A"/>
+          <w:sz w:val="19"/>
+          <w:shd w:val="clear" w:fill="F4F5F7"/>
+        </w:rPr>
+        <w:t>README.automation.md</w:t>
+      </w:r>
+      <w:r>
+        <w:rPr>
+          <w:b w:val="0"/>
+          <w:i w:val="0"/>
+          <w:color w:val="172B4D"/>
+          <w:sz w:val="21"/>
+        </w:rPr>
+        <w:t xml:space="preserve"> and is </w:t>
+      </w:r>
+      <w:r>
+        <w:rPr>
+          <w:b/>
+          <w:i w:val="0"/>
+          <w:color w:val="172B4D"/>
+          <w:sz w:val="21"/>
+        </w:rPr>
+        <w:t>promoted to `README.md` at spin-up</w:t>
+      </w:r>
+      <w:r>
+        <w:rPr>
+          <w:b w:val="0"/>
+          <w:i w:val="0"/>
+          <w:color w:val="172B4D"/>
+          <w:sz w:val="21"/>
+        </w:rPr>
+        <w:t xml:space="preserve"> — Step 0 in </w:t>
+      </w:r>
+      <w:r>
+        <w:rPr>
+          <w:rFonts w:ascii="Consolas" w:hAnsi="Consolas"/>
+          <w:b w:val="0"/>
+          <w:i w:val="0"/>
+          <w:color w:val="40302A"/>
+          <w:sz w:val="19"/>
+          <w:shd w:val="clear" w:fill="F4F5F7"/>
+        </w:rPr>
+        <w:t>CLAUDE.md</w:t>
+      </w:r>
+      <w:r>
+        <w:rPr>
+          <w:b w:val="0"/>
+          <w:i w:val="0"/>
+          <w:color w:val="172B4D"/>
+          <w:sz w:val="21"/>
+        </w:rPr>
+        <w:t xml:space="preserve">: </w:t>
+      </w:r>
+      <w:r>
+        <w:rPr>
+          <w:rFonts w:ascii="Consolas" w:hAnsi="Consolas"/>
+          <w:b w:val="0"/>
+          <w:i w:val="0"/>
+          <w:color w:val="40302A"/>
+          <w:sz w:val="19"/>
+          <w:shd w:val="clear" w:fill="F4F5F7"/>
+        </w:rPr>
+        <w:t>rm README.md &amp;&amp; mv README.automation.md README.md</w:t>
+      </w:r>
+      <w:r>
+        <w:rPr>
+          <w:b w:val="0"/>
+          <w:i w:val="0"/>
+          <w:color w:val="172B4D"/>
+          <w:sz w:val="21"/>
+        </w:rPr>
+        <w:t>.</w:t>
       </w:r>
     </w:p>
     <w:p>
@@ -4842,16 +4836,16 @@
           <w:color w:val="172B4D"/>
           <w:sz w:val="21"/>
         </w:rPr>
-        <w:t>Excel dual-policy tightened.</w:t>
-      </w:r>
-      <w:r>
-        <w:rPr>
-          <w:b w:val="0"/>
-          <w:i w:val="0"/>
-          <w:color w:val="172B4D"/>
-          <w:sz w:val="21"/>
-        </w:rPr>
-        <w:t xml:space="preserve"> An early "raw openpyxl for standalone tools" idea was</w:t>
+        <w:t>Why.</w:t>
+      </w:r>
+      <w:r>
+        <w:rPr>
+          <w:b w:val="0"/>
+          <w:i w:val="0"/>
+          <w:color w:val="172B4D"/>
+          <w:sz w:val="21"/>
+        </w:rPr>
+        <w:t xml:space="preserve"> One README can't serve both the "evaluate the template on GitHub" moment and</w:t>
       </w:r>
     </w:p>
     <w:p>
@@ -4865,47 +4859,7 @@
           <w:color w:val="172B4D"/>
           <w:sz w:val="21"/>
         </w:rPr>
-        <w:t>narrowed to "</w:t>
-      </w:r>
-      <w:r>
-        <w:rPr>
-          <w:rFonts w:ascii="Consolas" w:hAnsi="Consolas"/>
-          <w:b w:val="0"/>
-          <w:i w:val="0"/>
-          <w:color w:val="40302A"/>
-          <w:sz w:val="19"/>
-          <w:shd w:val="clear" w:fill="F4F5F7"/>
-        </w:rPr>
-        <w:t>render()</w:t>
-      </w:r>
-      <w:r>
-        <w:rPr>
-          <w:b w:val="0"/>
-          <w:i w:val="0"/>
-          <w:color w:val="172B4D"/>
-          <w:sz w:val="21"/>
-        </w:rPr>
-        <w:t xml:space="preserve"> mandatory + a narrow, explicitly-declared escape hatch" (§4.4), matching the existing hard-won </w:t>
-      </w:r>
-      <w:r>
-        <w:rPr>
-          <w:rFonts w:ascii="Consolas" w:hAnsi="Consolas"/>
-          <w:b w:val="0"/>
-          <w:i w:val="0"/>
-          <w:color w:val="40302A"/>
-          <w:sz w:val="19"/>
-          <w:shd w:val="clear" w:fill="F4F5F7"/>
-        </w:rPr>
-        <w:t>CLAUDE.md</w:t>
-      </w:r>
-      <w:r>
-        <w:rPr>
-          <w:b w:val="0"/>
-          <w:i w:val="0"/>
-          <w:color w:val="172B4D"/>
-          <w:sz w:val="21"/>
-        </w:rPr>
-        <w:t xml:space="preserve"> rule rather than loosening it.</w:t>
+        <w:t>the "run the shipped automation" moment — it is the landing page for both. Splitting by lifecycle moment, bridged by a one-line promote, gives each its right first impression.</w:t>
       </w:r>
     </w:p>
     <w:p>
@@ -4920,16 +4874,36 @@
           <w:color w:val="172B4D"/>
           <w:sz w:val="21"/>
         </w:rPr>
-        <w:t>Data-exposure remediation deprioritised.</w:t>
-      </w:r>
-      <w:r>
-        <w:rPr>
-          <w:b w:val="0"/>
-          <w:i w:val="0"/>
-          <w:color w:val="172B4D"/>
-          <w:sz w:val="21"/>
-        </w:rPr>
-        <w:t xml:space="preserve"> The committed-traces leak (§4.6) is real,</w:t>
+        <w:t>Consequence.</w:t>
+      </w:r>
+      <w:r>
+        <w:rPr>
+          <w:b w:val="0"/>
+          <w:i w:val="0"/>
+          <w:color w:val="172B4D"/>
+          <w:sz w:val="21"/>
+        </w:rPr>
+        <w:t xml:space="preserve"> The promote is manual until </w:t>
+      </w:r>
+      <w:r>
+        <w:rPr>
+          <w:rFonts w:ascii="Consolas" w:hAnsi="Consolas"/>
+          <w:b w:val="0"/>
+          <w:i w:val="0"/>
+          <w:color w:val="40302A"/>
+          <w:sz w:val="19"/>
+          <w:shd w:val="clear" w:fill="F4F5F7"/>
+        </w:rPr>
+        <w:t>copier</w:t>
+      </w:r>
+      <w:r>
+        <w:rPr>
+          <w:b w:val="0"/>
+          <w:i w:val="0"/>
+          <w:color w:val="172B4D"/>
+          <w:sz w:val="21"/>
+        </w:rPr>
+        <w:t xml:space="preserve"> lands (copier can do the rename on</w:t>
       </w:r>
     </w:p>
     <w:p>
@@ -4943,25 +4917,7 @@
           <w:color w:val="172B4D"/>
           <w:sz w:val="21"/>
         </w:rPr>
-        <w:t xml:space="preserve">but the sponsor judged it intra-firm with no client harm and out of scope for this asset; history rewrite + force-push to a shared remote is destructive and team- coordinated. So the harness </w:t>
-      </w:r>
-      <w:r>
-        <w:rPr>
-          <w:b w:val="0"/>
-          <w:i/>
-          <w:color w:val="626F86"/>
-          <w:sz w:val="21"/>
-        </w:rPr>
-        <w:t>prevents</w:t>
-      </w:r>
-      <w:r>
-        <w:rPr>
-          <w:b w:val="0"/>
-          <w:i w:val="0"/>
-          <w:color w:val="172B4D"/>
-          <w:sz w:val="21"/>
-        </w:rPr>
-        <w:t xml:space="preserve"> the pattern going forward (safe </w:t>
+        <w:t xml:space="preserve">generation — §5, §9). The dev boilerplate and a public </w:t>
       </w:r>
       <w:r>
         <w:rPr>
@@ -4972,16 +4928,29 @@
           <w:sz w:val="19"/>
           <w:shd w:val="clear" w:fill="F4F5F7"/>
         </w:rPr>
-        <w:t>.gitignore</w:t>
-      </w:r>
-      <w:r>
-        <w:rPr>
-          <w:b w:val="0"/>
-          <w:i w:val="0"/>
-          <w:color w:val="172B4D"/>
-          <w:sz w:val="21"/>
-        </w:rPr>
-        <w:t>) without rewriting existing history.</w:t>
+        <w:t>Mrinmayas/arena</w:t>
+      </w:r>
+      <w:r>
+        <w:rPr>
+          <w:b w:val="0"/>
+          <w:i w:val="0"/>
+          <w:color w:val="172B4D"/>
+          <w:sz w:val="21"/>
+        </w:rPr>
+        <w:t xml:space="preserve"> mirror are kept byte-for-byte in sync with the template.</w:t>
+      </w:r>
+    </w:p>
+    <w:p>
+      <w:pPr>
+        <w:spacing w:before="160" w:after="80"/>
+      </w:pPr>
+      <w:r>
+        <w:rPr>
+          <w:b/>
+          <w:color w:val="172B4D"/>
+          <w:sz w:val="25"/>
+        </w:rPr>
+        <w:t>4.9 Portal login — a persistent profile with session teardown</w:t>
       </w:r>
     </w:p>
     <w:p>
@@ -4996,16 +4965,16 @@
           <w:color w:val="172B4D"/>
           <w:sz w:val="21"/>
         </w:rPr>
-        <w:t>ROI framing corrected.</w:t>
-      </w:r>
-      <w:r>
-        <w:rPr>
-          <w:b w:val="0"/>
-          <w:i w:val="0"/>
-          <w:color w:val="172B4D"/>
-          <w:sz w:val="21"/>
-        </w:rPr>
-        <w:t xml:space="preserve"> Early illustrative day-counts ("1 week → 3.5 days") were</w:t>
+        <w:t>Context.</w:t>
+      </w:r>
+      <w:r>
+        <w:rPr>
+          <w:b w:val="0"/>
+          <w:i w:val="0"/>
+          <w:color w:val="172B4D"/>
+          <w:sz w:val="21"/>
+        </w:rPr>
+        <w:t xml:space="preserve"> Most portals sit behind Entra SSO with Conditional Access, which requires a</w:t>
       </w:r>
     </w:p>
     <w:p>
@@ -5015,12 +4984,27 @@
       <w:r>
         <w:rPr>
           <w:b w:val="0"/>
-          <w:i w:val="0"/>
-          <w:color w:val="172B4D"/>
-          <w:sz w:val="21"/>
-        </w:rPr>
-        <w:t xml:space="preserve">dropped in favour of </w:t>
-      </w:r>
+          <w:i/>
+          <w:color w:val="626F86"/>
+          <w:sz w:val="21"/>
+        </w:rPr>
+        <w:t>compliant device</w:t>
+      </w:r>
+      <w:r>
+        <w:rPr>
+          <w:b w:val="0"/>
+          <w:i w:val="0"/>
+          <w:color w:val="172B4D"/>
+          <w:sz w:val="21"/>
+        </w:rPr>
+        <w:t>; a throwaway browser profile is rejected as non-compliant and blocked.</w:t>
+      </w:r>
+    </w:p>
+    <w:p>
+      <w:pPr>
+        <w:pStyle w:val="ListBullet"/>
+        <w:spacing w:after="20"/>
+      </w:pPr>
       <w:r>
         <w:rPr>
           <w:b/>
@@ -5028,16 +5012,300 @@
           <w:color w:val="172B4D"/>
           <w:sz w:val="21"/>
         </w:rPr>
-        <w:t>~35% build effort saved per use case</w:t>
-      </w:r>
-      <w:r>
-        <w:rPr>
-          <w:b w:val="0"/>
-          <w:i w:val="0"/>
-          <w:color w:val="172B4D"/>
-          <w:sz w:val="21"/>
-        </w:rPr>
-        <w:t>, with the build-vs-operator distinction made explicit (§1).</w:t>
+        <w:t>Decision.</w:t>
+      </w:r>
+      <w:r>
+        <w:rPr>
+          <w:b w:val="0"/>
+          <w:i w:val="0"/>
+          <w:color w:val="172B4D"/>
+          <w:sz w:val="21"/>
+        </w:rPr>
+        <w:t xml:space="preserve"> </w:t>
+      </w:r>
+      <w:r>
+        <w:rPr>
+          <w:rFonts w:ascii="Consolas" w:hAnsi="Consolas"/>
+          <w:b w:val="0"/>
+          <w:i w:val="0"/>
+          <w:color w:val="40302A"/>
+          <w:sz w:val="19"/>
+          <w:shd w:val="clear" w:fill="F4F5F7"/>
+        </w:rPr>
+        <w:t>core.portals</w:t>
+      </w:r>
+      <w:r>
+        <w:rPr>
+          <w:b w:val="0"/>
+          <w:i w:val="0"/>
+          <w:color w:val="172B4D"/>
+          <w:sz w:val="21"/>
+        </w:rPr>
+        <w:t xml:space="preserve"> launches the default browser channel against a **persistent</w:t>
+      </w:r>
+    </w:p>
+    <w:p>
+      <w:pPr>
+        <w:spacing w:after="120"/>
+      </w:pPr>
+      <w:r>
+        <w:rPr>
+          <w:b w:val="0"/>
+          <w:i w:val="0"/>
+          <w:color w:val="172B4D"/>
+          <w:sz w:val="21"/>
+        </w:rPr>
+        <w:t>on-disk profile (</w:t>
+      </w:r>
+      <w:r>
+        <w:rPr>
+          <w:rFonts w:ascii="Consolas" w:hAnsi="Consolas"/>
+          <w:b w:val="0"/>
+          <w:i w:val="0"/>
+          <w:color w:val="40302A"/>
+          <w:sz w:val="19"/>
+          <w:shd w:val="clear" w:fill="F4F5F7"/>
+        </w:rPr>
+        <w:t>user_data_dir</w:t>
+      </w:r>
+      <w:r>
+        <w:rPr>
+          <w:b w:val="0"/>
+          <w:i w:val="0"/>
+          <w:color w:val="172B4D"/>
+          <w:sz w:val="21"/>
+        </w:rPr>
+        <w:t>)</w:t>
+      </w:r>
+      <w:r>
+        <w:rPr>
+          <w:b/>
+          <w:i w:val="0"/>
+          <w:color w:val="172B4D"/>
+          <w:sz w:val="21"/>
+        </w:rPr>
+        <w:t xml:space="preserve">, so the device's real compliance state is presented — log in once, reuse the session across runs. On close, a </w:t>
+      </w:r>
+      <w:r>
+        <w:rPr>
+          <w:b w:val="0"/>
+          <w:i w:val="0"/>
+          <w:color w:val="172B4D"/>
+          <w:sz w:val="21"/>
+        </w:rPr>
+        <w:t xml:space="preserve">teardown clears the web session (cookies + </w:t>
+      </w:r>
+      <w:r>
+        <w:rPr>
+          <w:rFonts w:ascii="Consolas" w:hAnsi="Consolas"/>
+          <w:b w:val="0"/>
+          <w:i w:val="0"/>
+          <w:color w:val="40302A"/>
+          <w:sz w:val="19"/>
+          <w:shd w:val="clear" w:fill="F4F5F7"/>
+        </w:rPr>
+        <w:t>localStorage</w:t>
+      </w:r>
+      <w:r>
+        <w:rPr>
+          <w:b w:val="0"/>
+          <w:i w:val="0"/>
+          <w:color w:val="172B4D"/>
+          <w:sz w:val="21"/>
+        </w:rPr>
+        <w:t>/</w:t>
+      </w:r>
+      <w:r>
+        <w:rPr>
+          <w:rFonts w:ascii="Consolas" w:hAnsi="Consolas"/>
+          <w:b w:val="0"/>
+          <w:i w:val="0"/>
+          <w:color w:val="40302A"/>
+          <w:sz w:val="19"/>
+          <w:shd w:val="clear" w:fill="F4F5F7"/>
+        </w:rPr>
+        <w:t>sessionStorage</w:t>
+      </w:r>
+      <w:r>
+        <w:rPr>
+          <w:b w:val="0"/>
+          <w:i w:val="0"/>
+          <w:color w:val="172B4D"/>
+          <w:sz w:val="21"/>
+        </w:rPr>
+        <w:t xml:space="preserve">) but keeps the profile** (best-effort, never raises); the low-level launcher also closes context + browser in a </w:t>
+      </w:r>
+      <w:r>
+        <w:rPr>
+          <w:rFonts w:ascii="Consolas" w:hAnsi="Consolas"/>
+          <w:b w:val="0"/>
+          <w:i w:val="0"/>
+          <w:color w:val="40302A"/>
+          <w:sz w:val="19"/>
+          <w:shd w:val="clear" w:fill="F4F5F7"/>
+        </w:rPr>
+        <w:t>finally</w:t>
+      </w:r>
+      <w:r>
+        <w:rPr>
+          <w:b w:val="0"/>
+          <w:i w:val="0"/>
+          <w:color w:val="172B4D"/>
+          <w:sz w:val="21"/>
+        </w:rPr>
+        <w:t xml:space="preserve">. Credentials for username/password portals come from </w:t>
+      </w:r>
+      <w:r>
+        <w:rPr>
+          <w:rFonts w:ascii="Consolas" w:hAnsi="Consolas"/>
+          <w:b w:val="0"/>
+          <w:i w:val="0"/>
+          <w:color w:val="40302A"/>
+          <w:sz w:val="19"/>
+          <w:shd w:val="clear" w:fill="F4F5F7"/>
+        </w:rPr>
+        <w:t>core.secretstore</w:t>
+      </w:r>
+      <w:r>
+        <w:rPr>
+          <w:b w:val="0"/>
+          <w:i w:val="0"/>
+          <w:color w:val="172B4D"/>
+          <w:sz w:val="21"/>
+        </w:rPr>
+        <w:t xml:space="preserve"> (OS keychain), never source.</w:t>
+      </w:r>
+    </w:p>
+    <w:p>
+      <w:pPr>
+        <w:pStyle w:val="ListBullet"/>
+        <w:spacing w:after="20"/>
+      </w:pPr>
+      <w:r>
+        <w:rPr>
+          <w:b/>
+          <w:i w:val="0"/>
+          <w:color w:val="172B4D"/>
+          <w:sz w:val="21"/>
+        </w:rPr>
+        <w:t>Why.</w:t>
+      </w:r>
+      <w:r>
+        <w:rPr>
+          <w:b w:val="0"/>
+          <w:i w:val="0"/>
+          <w:color w:val="172B4D"/>
+          <w:sz w:val="21"/>
+        </w:rPr>
+        <w:t xml:space="preserve"> The persistent profile is what makes Conditional-Access SSO work unattended;</w:t>
+      </w:r>
+    </w:p>
+    <w:p>
+      <w:pPr>
+        <w:spacing w:after="120"/>
+      </w:pPr>
+      <w:r>
+        <w:rPr>
+          <w:b w:val="0"/>
+          <w:i w:val="0"/>
+          <w:color w:val="172B4D"/>
+          <w:sz w:val="21"/>
+        </w:rPr>
+        <w:t xml:space="preserve">clearing the web session each run gives a clean login </w:t>
+      </w:r>
+      <w:r>
+        <w:rPr>
+          <w:b w:val="0"/>
+          <w:i/>
+          <w:color w:val="626F86"/>
+          <w:sz w:val="21"/>
+        </w:rPr>
+        <w:t>without</w:t>
+      </w:r>
+      <w:r>
+        <w:rPr>
+          <w:b w:val="0"/>
+          <w:i w:val="0"/>
+          <w:color w:val="172B4D"/>
+          <w:sz w:val="21"/>
+        </w:rPr>
+        <w:t xml:space="preserve"> discarding the device identity Conditional Access depends on. Keeping the two separate — </w:t>
+      </w:r>
+      <w:r>
+        <w:rPr>
+          <w:b/>
+          <w:i w:val="0"/>
+          <w:color w:val="172B4D"/>
+          <w:sz w:val="21"/>
+        </w:rPr>
+        <w:t>disposable session, durable device profile</w:t>
+      </w:r>
+      <w:r>
+        <w:rPr>
+          <w:b w:val="0"/>
+          <w:i w:val="0"/>
+          <w:color w:val="172B4D"/>
+          <w:sz w:val="21"/>
+        </w:rPr>
+        <w:t xml:space="preserve"> — is the non-obvious lesson a naive "clear everything on teardown" would break (it would silently re-trigger a compliance block).</w:t>
+      </w:r>
+    </w:p>
+    <w:p>
+      <w:pPr>
+        <w:pStyle w:val="ListBullet"/>
+        <w:spacing w:after="20"/>
+      </w:pPr>
+      <w:r>
+        <w:rPr>
+          <w:b/>
+          <w:i w:val="0"/>
+          <w:color w:val="172B4D"/>
+          <w:sz w:val="21"/>
+        </w:rPr>
+        <w:t>Consequence.</w:t>
+      </w:r>
+      <w:r>
+        <w:rPr>
+          <w:b w:val="0"/>
+          <w:i w:val="0"/>
+          <w:color w:val="172B4D"/>
+          <w:sz w:val="21"/>
+        </w:rPr>
+        <w:t xml:space="preserve"> </w:t>
+      </w:r>
+      <w:r>
+        <w:rPr>
+          <w:rFonts w:ascii="Consolas" w:hAnsi="Consolas"/>
+          <w:b w:val="0"/>
+          <w:i w:val="0"/>
+          <w:color w:val="40302A"/>
+          <w:sz w:val="19"/>
+          <w:shd w:val="clear" w:fill="F4F5F7"/>
+        </w:rPr>
+        <w:t>core.portals</w:t>
+      </w:r>
+      <w:r>
+        <w:rPr>
+          <w:b w:val="0"/>
+          <w:i w:val="0"/>
+          <w:color w:val="172B4D"/>
+          <w:sz w:val="21"/>
+        </w:rPr>
+        <w:t xml:space="preserve"> is engine-decoupled, so a simple download-and-process</w:t>
+      </w:r>
+    </w:p>
+    <w:p>
+      <w:pPr>
+        <w:spacing w:after="120"/>
+      </w:pPr>
+      <w:r>
+        <w:rPr>
+          <w:b w:val="0"/>
+          <w:i w:val="0"/>
+          <w:color w:val="172B4D"/>
+          <w:sz w:val="21"/>
+        </w:rPr>
+        <w:t>tool logs in without pulling in the engine; the recorder captures a flow (selectors + screenshots) during development.</w:t>
       </w:r>
     </w:p>
     <w:p>
@@ -5053,7 +5321,7 @@
           <w:color w:val="172B4D"/>
           <w:sz w:val="32"/>
         </w:rPr>
-        <w:t>6. What got built</w:t>
+        <w:t>5. Decisions we reversed — and why</w:t>
       </w:r>
     </w:p>
     <w:p>
@@ -5067,7 +5335,49 @@
           <w:color w:val="172B4D"/>
           <w:sz w:val="21"/>
         </w:rPr>
-        <w:t xml:space="preserve">On branch </w:t>
+        <w:t xml:space="preserve">Honest record of the thinking, because the reversals </w:t>
+      </w:r>
+      <w:r>
+        <w:rPr>
+          <w:b w:val="0"/>
+          <w:i/>
+          <w:color w:val="626F86"/>
+          <w:sz w:val="21"/>
+        </w:rPr>
+        <w:t>are</w:t>
+      </w:r>
+      <w:r>
+        <w:rPr>
+          <w:b w:val="0"/>
+          <w:i w:val="0"/>
+          <w:color w:val="172B4D"/>
+          <w:sz w:val="21"/>
+        </w:rPr>
+        <w:t xml:space="preserve"> the design process.</w:t>
+      </w:r>
+    </w:p>
+    <w:p>
+      <w:pPr>
+        <w:pStyle w:val="ListBullet"/>
+        <w:spacing w:after="20"/>
+      </w:pPr>
+      <w:r>
+        <w:rPr>
+          <w:b/>
+          <w:i w:val="0"/>
+          <w:color w:val="172B4D"/>
+          <w:sz w:val="21"/>
+        </w:rPr>
+        <w:t>Two scaffolds → one spine.</w:t>
+      </w:r>
+      <w:r>
+        <w:rPr>
+          <w:b w:val="0"/>
+          <w:i w:val="0"/>
+          <w:color w:val="172B4D"/>
+          <w:sz w:val="21"/>
+        </w:rPr>
+        <w:t xml:space="preserve"> Initially planned </w:t>
       </w:r>
       <w:r>
         <w:rPr>
@@ -5078,16 +5388,16 @@
           <w:sz w:val="19"/>
           <w:shd w:val="clear" w:fill="F4F5F7"/>
         </w:rPr>
-        <w:t>feature/ai-ops-boilerplate</w:t>
-      </w:r>
-      <w:r>
-        <w:rPr>
-          <w:b w:val="0"/>
-          <w:i w:val="0"/>
-          <w:color w:val="172B4D"/>
-          <w:sz w:val="21"/>
-        </w:rPr>
-        <w:t xml:space="preserve"> of the </w:t>
+        <w:t>simple</w:t>
+      </w:r>
+      <w:r>
+        <w:rPr>
+          <w:b w:val="0"/>
+          <w:i w:val="0"/>
+          <w:color w:val="172B4D"/>
+          <w:sz w:val="21"/>
+        </w:rPr>
+        <w:t xml:space="preserve"> + </w:t>
       </w:r>
       <w:r>
         <w:rPr>
@@ -5098,16 +5408,68 @@
           <w:sz w:val="19"/>
           <w:shd w:val="clear" w:fill="F4F5F7"/>
         </w:rPr>
-        <w:t>314495_wsa-automation</w:t>
-      </w:r>
-      <w:r>
-        <w:rPr>
-          <w:b w:val="0"/>
-          <w:i w:val="0"/>
-          <w:color w:val="172B4D"/>
-          <w:sz w:val="21"/>
-        </w:rPr>
-        <w:t xml:space="preserve"> repo (a git worktree; </w:t>
+        <w:t>orchestrated</w:t>
+      </w:r>
+      <w:r>
+        <w:rPr>
+          <w:b w:val="0"/>
+          <w:i w:val="0"/>
+          <w:color w:val="172B4D"/>
+          <w:sz w:val="21"/>
+        </w:rPr>
+        <w:t xml:space="preserve"> scaffolds.</w:t>
+      </w:r>
+    </w:p>
+    <w:p>
+      <w:pPr>
+        <w:spacing w:after="120"/>
+      </w:pPr>
+      <w:r>
+        <w:rPr>
+          <w:b w:val="0"/>
+          <w:i w:val="0"/>
+          <w:color w:val="172B4D"/>
+          <w:sz w:val="21"/>
+        </w:rPr>
+        <w:t>Reversed to a single spine with the engine opt-in, to avoid two divergent structures to maintain (§4.2).</w:t>
+      </w:r>
+    </w:p>
+    <w:p>
+      <w:pPr>
+        <w:pStyle w:val="ListBullet"/>
+        <w:spacing w:after="20"/>
+      </w:pPr>
+      <w:r>
+        <w:rPr>
+          <w:b/>
+          <w:i w:val="0"/>
+          <w:color w:val="172B4D"/>
+          <w:sz w:val="21"/>
+        </w:rPr>
+        <w:t>Vendored core was challenged.</w:t>
+      </w:r>
+      <w:r>
+        <w:rPr>
+          <w:b w:val="0"/>
+          <w:i w:val="0"/>
+          <w:color w:val="172B4D"/>
+          <w:sz w:val="21"/>
+        </w:rPr>
+        <w:t xml:space="preserve"> An independent critique argued for a versioned,</w:t>
+      </w:r>
+    </w:p>
+    <w:p>
+      <w:pPr>
+        <w:spacing w:after="120"/>
+      </w:pPr>
+      <w:r>
+        <w:rPr>
+          <w:b w:val="0"/>
+          <w:i w:val="0"/>
+          <w:color w:val="172B4D"/>
+          <w:sz w:val="21"/>
+        </w:rPr>
+        <w:t xml:space="preserve">installable </w:t>
       </w:r>
       <w:r>
         <w:rPr>
@@ -5118,16 +5480,16 @@
           <w:sz w:val="19"/>
           <w:shd w:val="clear" w:fill="F4F5F7"/>
         </w:rPr>
-        <w:t>main</w:t>
-      </w:r>
-      <w:r>
-        <w:rPr>
-          <w:b w:val="0"/>
-          <w:i w:val="0"/>
-          <w:color w:val="172B4D"/>
-          <w:sz w:val="21"/>
-        </w:rPr>
-        <w:t xml:space="preserve"> untouched), mirrored to the personal </w:t>
+        <w:t>wsa-core</w:t>
+      </w:r>
+      <w:r>
+        <w:rPr>
+          <w:b w:val="0"/>
+          <w:i w:val="0"/>
+          <w:color w:val="172B4D"/>
+          <w:sz w:val="21"/>
+        </w:rPr>
+        <w:t xml:space="preserve"> package pinned per repo instead of vendoring, plus </w:t>
       </w:r>
       <w:r>
         <w:rPr>
@@ -5138,6 +5500,400 @@
           <w:sz w:val="19"/>
           <w:shd w:val="clear" w:fill="F4F5F7"/>
         </w:rPr>
+        <w:t>copier</w:t>
+      </w:r>
+      <w:r>
+        <w:rPr>
+          <w:b w:val="0"/>
+          <w:i w:val="0"/>
+          <w:color w:val="172B4D"/>
+          <w:sz w:val="21"/>
+        </w:rPr>
+        <w:t xml:space="preserve"> for the shell. We kept </w:t>
+      </w:r>
+      <w:r>
+        <w:rPr>
+          <w:b/>
+          <w:i w:val="0"/>
+          <w:color w:val="172B4D"/>
+          <w:sz w:val="21"/>
+        </w:rPr>
+        <w:t>vendoring</w:t>
+      </w:r>
+      <w:r>
+        <w:rPr>
+          <w:b w:val="0"/>
+          <w:i w:val="0"/>
+          <w:color w:val="172B4D"/>
+          <w:sz w:val="21"/>
+        </w:rPr>
+        <w:t xml:space="preserve"> (it fits the self-contained, client-isolated, laptop- runnable model) but adopted the critique's real point: </w:t>
+      </w:r>
+      <w:r>
+        <w:rPr>
+          <w:rFonts w:ascii="Consolas" w:hAnsi="Consolas"/>
+          <w:b w:val="0"/>
+          <w:i w:val="0"/>
+          <w:color w:val="40302A"/>
+          <w:sz w:val="19"/>
+          <w:shd w:val="clear" w:fill="F4F5F7"/>
+        </w:rPr>
+        <w:t>copier update</w:t>
+      </w:r>
+      <w:r>
+        <w:rPr>
+          <w:b w:val="0"/>
+          <w:i w:val="0"/>
+          <w:color w:val="172B4D"/>
+          <w:sz w:val="21"/>
+        </w:rPr>
+        <w:t xml:space="preserve"> is the eventual answer to vendored-core drift. Copier is </w:t>
+      </w:r>
+      <w:r>
+        <w:rPr>
+          <w:b/>
+          <w:i w:val="0"/>
+          <w:color w:val="172B4D"/>
+          <w:sz w:val="21"/>
+        </w:rPr>
+        <w:t>deferred</w:t>
+      </w:r>
+      <w:r>
+        <w:rPr>
+          <w:b w:val="0"/>
+          <w:i w:val="0"/>
+          <w:color w:val="172B4D"/>
+          <w:sz w:val="21"/>
+        </w:rPr>
+        <w:t>, not rejected.</w:t>
+      </w:r>
+    </w:p>
+    <w:p>
+      <w:pPr>
+        <w:pStyle w:val="ListBullet"/>
+        <w:spacing w:after="20"/>
+      </w:pPr>
+      <w:r>
+        <w:rPr>
+          <w:b/>
+          <w:i w:val="0"/>
+          <w:color w:val="172B4D"/>
+          <w:sz w:val="21"/>
+        </w:rPr>
+        <w:t>Excel dual-policy tightened.</w:t>
+      </w:r>
+      <w:r>
+        <w:rPr>
+          <w:b w:val="0"/>
+          <w:i w:val="0"/>
+          <w:color w:val="172B4D"/>
+          <w:sz w:val="21"/>
+        </w:rPr>
+        <w:t xml:space="preserve"> An early "raw openpyxl for standalone tools" idea was</w:t>
+      </w:r>
+    </w:p>
+    <w:p>
+      <w:pPr>
+        <w:spacing w:after="120"/>
+      </w:pPr>
+      <w:r>
+        <w:rPr>
+          <w:b w:val="0"/>
+          <w:i w:val="0"/>
+          <w:color w:val="172B4D"/>
+          <w:sz w:val="21"/>
+        </w:rPr>
+        <w:t>narrowed to "</w:t>
+      </w:r>
+      <w:r>
+        <w:rPr>
+          <w:rFonts w:ascii="Consolas" w:hAnsi="Consolas"/>
+          <w:b w:val="0"/>
+          <w:i w:val="0"/>
+          <w:color w:val="40302A"/>
+          <w:sz w:val="19"/>
+          <w:shd w:val="clear" w:fill="F4F5F7"/>
+        </w:rPr>
+        <w:t>render()</w:t>
+      </w:r>
+      <w:r>
+        <w:rPr>
+          <w:b w:val="0"/>
+          <w:i w:val="0"/>
+          <w:color w:val="172B4D"/>
+          <w:sz w:val="21"/>
+        </w:rPr>
+        <w:t xml:space="preserve"> mandatory + a narrow, explicitly-declared escape hatch" (§4.4), matching the existing hard-won </w:t>
+      </w:r>
+      <w:r>
+        <w:rPr>
+          <w:rFonts w:ascii="Consolas" w:hAnsi="Consolas"/>
+          <w:b w:val="0"/>
+          <w:i w:val="0"/>
+          <w:color w:val="40302A"/>
+          <w:sz w:val="19"/>
+          <w:shd w:val="clear" w:fill="F4F5F7"/>
+        </w:rPr>
+        <w:t>CLAUDE.md</w:t>
+      </w:r>
+      <w:r>
+        <w:rPr>
+          <w:b w:val="0"/>
+          <w:i w:val="0"/>
+          <w:color w:val="172B4D"/>
+          <w:sz w:val="21"/>
+        </w:rPr>
+        <w:t xml:space="preserve"> rule rather than loosening it.</w:t>
+      </w:r>
+    </w:p>
+    <w:p>
+      <w:pPr>
+        <w:pStyle w:val="ListBullet"/>
+        <w:spacing w:after="20"/>
+      </w:pPr>
+      <w:r>
+        <w:rPr>
+          <w:b/>
+          <w:i w:val="0"/>
+          <w:color w:val="172B4D"/>
+          <w:sz w:val="21"/>
+        </w:rPr>
+        <w:t>Data-exposure remediation deprioritised.</w:t>
+      </w:r>
+      <w:r>
+        <w:rPr>
+          <w:b w:val="0"/>
+          <w:i w:val="0"/>
+          <w:color w:val="172B4D"/>
+          <w:sz w:val="21"/>
+        </w:rPr>
+        <w:t xml:space="preserve"> The committed-traces leak (§4.6) is real,</w:t>
+      </w:r>
+    </w:p>
+    <w:p>
+      <w:pPr>
+        <w:spacing w:after="120"/>
+      </w:pPr>
+      <w:r>
+        <w:rPr>
+          <w:b w:val="0"/>
+          <w:i w:val="0"/>
+          <w:color w:val="172B4D"/>
+          <w:sz w:val="21"/>
+        </w:rPr>
+        <w:t xml:space="preserve">but the sponsor judged it intra-firm with no client harm and out of scope for this asset; history rewrite + force-push to a shared remote is destructive and team- coordinated. So the harness </w:t>
+      </w:r>
+      <w:r>
+        <w:rPr>
+          <w:b w:val="0"/>
+          <w:i/>
+          <w:color w:val="626F86"/>
+          <w:sz w:val="21"/>
+        </w:rPr>
+        <w:t>prevents</w:t>
+      </w:r>
+      <w:r>
+        <w:rPr>
+          <w:b w:val="0"/>
+          <w:i w:val="0"/>
+          <w:color w:val="172B4D"/>
+          <w:sz w:val="21"/>
+        </w:rPr>
+        <w:t xml:space="preserve"> the pattern going forward (safe </w:t>
+      </w:r>
+      <w:r>
+        <w:rPr>
+          <w:rFonts w:ascii="Consolas" w:hAnsi="Consolas"/>
+          <w:b w:val="0"/>
+          <w:i w:val="0"/>
+          <w:color w:val="40302A"/>
+          <w:sz w:val="19"/>
+          <w:shd w:val="clear" w:fill="F4F5F7"/>
+        </w:rPr>
+        <w:t>.gitignore</w:t>
+      </w:r>
+      <w:r>
+        <w:rPr>
+          <w:b w:val="0"/>
+          <w:i w:val="0"/>
+          <w:color w:val="172B4D"/>
+          <w:sz w:val="21"/>
+        </w:rPr>
+        <w:t>) without rewriting existing history.</w:t>
+      </w:r>
+    </w:p>
+    <w:p>
+      <w:pPr>
+        <w:pStyle w:val="ListBullet"/>
+        <w:spacing w:after="20"/>
+      </w:pPr>
+      <w:r>
+        <w:rPr>
+          <w:b/>
+          <w:i w:val="0"/>
+          <w:color w:val="172B4D"/>
+          <w:sz w:val="21"/>
+        </w:rPr>
+        <w:t>ROI framing corrected.</w:t>
+      </w:r>
+      <w:r>
+        <w:rPr>
+          <w:b w:val="0"/>
+          <w:i w:val="0"/>
+          <w:color w:val="172B4D"/>
+          <w:sz w:val="21"/>
+        </w:rPr>
+        <w:t xml:space="preserve"> Early illustrative day-counts ("1 week → 3.5 days") were</w:t>
+      </w:r>
+    </w:p>
+    <w:p>
+      <w:pPr>
+        <w:spacing w:after="120"/>
+      </w:pPr>
+      <w:r>
+        <w:rPr>
+          <w:b w:val="0"/>
+          <w:i w:val="0"/>
+          <w:color w:val="172B4D"/>
+          <w:sz w:val="21"/>
+        </w:rPr>
+        <w:t xml:space="preserve">dropped in favour of </w:t>
+      </w:r>
+      <w:r>
+        <w:rPr>
+          <w:b/>
+          <w:i w:val="0"/>
+          <w:color w:val="172B4D"/>
+          <w:sz w:val="21"/>
+        </w:rPr>
+        <w:t>~35% build effort saved per use case</w:t>
+      </w:r>
+      <w:r>
+        <w:rPr>
+          <w:b w:val="0"/>
+          <w:i w:val="0"/>
+          <w:color w:val="172B4D"/>
+          <w:sz w:val="21"/>
+        </w:rPr>
+        <w:t>, with the build-vs-operator distinction made explicit (§1).</w:t>
+      </w:r>
+    </w:p>
+    <w:p>
+      <w:pPr>
+        <w:spacing w:before="280" w:after="80"/>
+        <w:pBdr>
+          <w:bottom w:val="single" w:sz="6" w:space="1" w:color="DFE1E6"/>
+        </w:pBdr>
+      </w:pPr>
+      <w:r>
+        <w:rPr>
+          <w:b/>
+          <w:color w:val="172B4D"/>
+          <w:sz w:val="32"/>
+        </w:rPr>
+        <w:t>6. What got built</w:t>
+      </w:r>
+    </w:p>
+    <w:p>
+      <w:pPr>
+        <w:spacing w:after="120"/>
+      </w:pPr>
+      <w:r>
+        <w:rPr>
+          <w:b w:val="0"/>
+          <w:i w:val="0"/>
+          <w:color w:val="172B4D"/>
+          <w:sz w:val="21"/>
+        </w:rPr>
+        <w:t xml:space="preserve">Built on branch </w:t>
+      </w:r>
+      <w:r>
+        <w:rPr>
+          <w:rFonts w:ascii="Consolas" w:hAnsi="Consolas"/>
+          <w:b w:val="0"/>
+          <w:i w:val="0"/>
+          <w:color w:val="40302A"/>
+          <w:sz w:val="19"/>
+          <w:shd w:val="clear" w:fill="F4F5F7"/>
+        </w:rPr>
+        <w:t>feature/ai-ops-boilerplate</w:t>
+      </w:r>
+      <w:r>
+        <w:rPr>
+          <w:b w:val="0"/>
+          <w:i w:val="0"/>
+          <w:color w:val="172B4D"/>
+          <w:sz w:val="21"/>
+        </w:rPr>
+        <w:t xml:space="preserve"> of the </w:t>
+      </w:r>
+      <w:r>
+        <w:rPr>
+          <w:rFonts w:ascii="Consolas" w:hAnsi="Consolas"/>
+          <w:b w:val="0"/>
+          <w:i w:val="0"/>
+          <w:color w:val="40302A"/>
+          <w:sz w:val="19"/>
+          <w:shd w:val="clear" w:fill="F4F5F7"/>
+        </w:rPr>
+        <w:t>314495_wsa-automation</w:t>
+      </w:r>
+      <w:r>
+        <w:rPr>
+          <w:b w:val="0"/>
+          <w:i w:val="0"/>
+          <w:color w:val="172B4D"/>
+          <w:sz w:val="21"/>
+        </w:rPr>
+        <w:t xml:space="preserve"> repo (a git worktree; </w:t>
+      </w:r>
+      <w:r>
+        <w:rPr>
+          <w:rFonts w:ascii="Consolas" w:hAnsi="Consolas"/>
+          <w:b w:val="0"/>
+          <w:i w:val="0"/>
+          <w:color w:val="40302A"/>
+          <w:sz w:val="19"/>
+          <w:shd w:val="clear" w:fill="F4F5F7"/>
+        </w:rPr>
+        <w:t>main</w:t>
+      </w:r>
+      <w:r>
+        <w:rPr>
+          <w:b w:val="0"/>
+          <w:i w:val="0"/>
+          <w:color w:val="172B4D"/>
+          <w:sz w:val="21"/>
+        </w:rPr>
+        <w:t xml:space="preserve"> untouched) and </w:t>
+      </w:r>
+      <w:r>
+        <w:rPr>
+          <w:b/>
+          <w:i w:val="0"/>
+          <w:color w:val="172B4D"/>
+          <w:sz w:val="21"/>
+        </w:rPr>
+        <w:t>published as the GitHub template repo `314495_ai-ops-harness-swat`</w:t>
+      </w:r>
+      <w:r>
+        <w:rPr>
+          <w:b w:val="0"/>
+          <w:i w:val="0"/>
+          <w:color w:val="172B4D"/>
+          <w:sz w:val="21"/>
+        </w:rPr>
+        <w:t xml:space="preserve"> ("Use this template" enabled); a public </w:t>
+      </w:r>
+      <w:r>
+        <w:rPr>
+          <w:rFonts w:ascii="Consolas" w:hAnsi="Consolas"/>
+          <w:b w:val="0"/>
+          <w:i w:val="0"/>
+          <w:color w:val="40302A"/>
+          <w:sz w:val="19"/>
+          <w:shd w:val="clear" w:fill="F4F5F7"/>
+        </w:rPr>
         <w:t>Mrinmayas/arena</w:t>
       </w:r>
       <w:r>
@@ -5147,7 +5903,7 @@
           <w:color w:val="172B4D"/>
           <w:sz w:val="21"/>
         </w:rPr>
-        <w:t xml:space="preserve"> repo. </w:t>
+        <w:t xml:space="preserve"> copy mirrors it. All three are kept byte-for-byte in sync. </w:t>
       </w:r>
       <w:r>
         <w:rPr>
@@ -6100,7 +6856,7 @@
           <w:color w:val="172B4D"/>
           <w:sz w:val="21"/>
         </w:rPr>
-        <w:t xml:space="preserve"> (house rules for the AI assistant), the capability-extras </w:t>
+        <w:t xml:space="preserve"> (house rules for the AI assistant, incl. Step 0), the two-README pair (</w:t>
       </w:r>
       <w:r>
         <w:rPr>
@@ -6111,16 +6867,16 @@
           <w:sz w:val="19"/>
           <w:shd w:val="clear" w:fill="F4F5F7"/>
         </w:rPr>
-        <w:t>pyproject.toml</w:t>
-      </w:r>
-      <w:r>
-        <w:rPr>
-          <w:b w:val="0"/>
-          <w:i w:val="0"/>
-          <w:color w:val="172B4D"/>
-          <w:sz w:val="21"/>
-        </w:rPr>
-        <w:t xml:space="preserve">, and </w:t>
+        <w:t>README.md</w:t>
+      </w:r>
+      <w:r>
+        <w:rPr>
+          <w:b w:val="0"/>
+          <w:i w:val="0"/>
+          <w:color w:val="172B4D"/>
+          <w:sz w:val="21"/>
+        </w:rPr>
+        <w:t xml:space="preserve"> harness page + </w:t>
       </w:r>
       <w:r>
         <w:rPr>
@@ -6131,16 +6887,96 @@
           <w:sz w:val="19"/>
           <w:shd w:val="clear" w:fill="F4F5F7"/>
         </w:rPr>
-        <w:t>docs/solution.html</w:t>
-      </w:r>
-      <w:r>
-        <w:rPr>
-          <w:b w:val="0"/>
-          <w:i w:val="0"/>
-          <w:color w:val="172B4D"/>
-          <w:sz w:val="21"/>
-        </w:rPr>
-        <w:t xml:space="preserve"> (the value-forward, six-page solution document).</w:t>
+        <w:t>README.automation.md</w:t>
+      </w:r>
+      <w:r>
+        <w:rPr>
+          <w:b w:val="0"/>
+          <w:i w:val="0"/>
+          <w:color w:val="172B4D"/>
+          <w:sz w:val="21"/>
+        </w:rPr>
+        <w:t xml:space="preserve"> run-guide), the capability-extras </w:t>
+      </w:r>
+      <w:r>
+        <w:rPr>
+          <w:rFonts w:ascii="Consolas" w:hAnsi="Consolas"/>
+          <w:b w:val="0"/>
+          <w:i w:val="0"/>
+          <w:color w:val="40302A"/>
+          <w:sz w:val="19"/>
+          <w:shd w:val="clear" w:fill="F4F5F7"/>
+        </w:rPr>
+        <w:t>pyproject.toml</w:t>
+      </w:r>
+      <w:r>
+        <w:rPr>
+          <w:b w:val="0"/>
+          <w:i w:val="0"/>
+          <w:color w:val="172B4D"/>
+          <w:sz w:val="21"/>
+        </w:rPr>
+        <w:t xml:space="preserve">, and — under </w:t>
+      </w:r>
+      <w:r>
+        <w:rPr>
+          <w:rFonts w:ascii="Consolas" w:hAnsi="Consolas"/>
+          <w:b w:val="0"/>
+          <w:i w:val="0"/>
+          <w:color w:val="40302A"/>
+          <w:sz w:val="19"/>
+          <w:shd w:val="clear" w:fill="F4F5F7"/>
+        </w:rPr>
+        <w:t>docs/_harness/</w:t>
+      </w:r>
+      <w:r>
+        <w:rPr>
+          <w:b w:val="0"/>
+          <w:i w:val="0"/>
+          <w:color w:val="172B4D"/>
+          <w:sz w:val="21"/>
+        </w:rPr>
+        <w:t xml:space="preserve"> — the value-forward </w:t>
+      </w:r>
+      <w:r>
+        <w:rPr>
+          <w:rFonts w:ascii="Consolas" w:hAnsi="Consolas"/>
+          <w:b w:val="0"/>
+          <w:i w:val="0"/>
+          <w:color w:val="40302A"/>
+          <w:sz w:val="19"/>
+          <w:shd w:val="clear" w:fill="F4F5F7"/>
+        </w:rPr>
+        <w:t>solution.html</w:t>
+      </w:r>
+      <w:r>
+        <w:rPr>
+          <w:b w:val="0"/>
+          <w:i w:val="0"/>
+          <w:color w:val="172B4D"/>
+          <w:sz w:val="21"/>
+        </w:rPr>
+        <w:t xml:space="preserve">, the </w:t>
+      </w:r>
+      <w:r>
+        <w:rPr>
+          <w:rFonts w:ascii="Consolas" w:hAnsi="Consolas"/>
+          <w:b w:val="0"/>
+          <w:i w:val="0"/>
+          <w:color w:val="40302A"/>
+          <w:sz w:val="19"/>
+          <w:shd w:val="clear" w:fill="F4F5F7"/>
+        </w:rPr>
+        <w:t>CAPABILITIES.md</w:t>
+      </w:r>
+      <w:r>
+        <w:rPr>
+          <w:b w:val="0"/>
+          <w:i w:val="0"/>
+          <w:color w:val="172B4D"/>
+          <w:sz w:val="21"/>
+        </w:rPr>
+        <w:t xml:space="preserve"> catalogue ("what the harness produces"), and this design journal.</w:t>
       </w:r>
     </w:p>
     <w:p>
@@ -6542,6 +7378,74 @@
     </w:p>
     <w:p>
       <w:pPr>
+        <w:spacing w:after="120"/>
+      </w:pPr>
+      <w:r>
+        <w:rPr>
+          <w:b w:val="0"/>
+          <w:i w:val="0"/>
+          <w:color w:val="172B4D"/>
+          <w:sz w:val="21"/>
+        </w:rPr>
+        <w:t xml:space="preserve">It also frames each build's outputs as </w:t>
+      </w:r>
+      <w:r>
+        <w:rPr>
+          <w:b/>
+          <w:i w:val="0"/>
+          <w:color w:val="172B4D"/>
+          <w:sz w:val="21"/>
+        </w:rPr>
+        <w:t>products</w:t>
+      </w:r>
+      <w:r>
+        <w:rPr>
+          <w:b w:val="0"/>
+          <w:i w:val="0"/>
+          <w:color w:val="172B4D"/>
+          <w:sz w:val="21"/>
+        </w:rPr>
+        <w:t xml:space="preserve"> — the application, the sign-off audit trail, the Excel deliverable, the operator guide, the workflow diagram, the tests — each tagged with the skill that generates it, so the skills read as </w:t>
+      </w:r>
+      <w:r>
+        <w:rPr>
+          <w:b w:val="0"/>
+          <w:i/>
+          <w:color w:val="626F86"/>
+          <w:sz w:val="21"/>
+        </w:rPr>
+        <w:t>value-generators</w:t>
+      </w:r>
+      <w:r>
+        <w:rPr>
+          <w:b w:val="0"/>
+          <w:i w:val="0"/>
+          <w:color w:val="172B4D"/>
+          <w:sz w:val="21"/>
+        </w:rPr>
+        <w:t xml:space="preserve"> rather than a feature list. And its first page speaks in an </w:t>
+      </w:r>
+      <w:r>
+        <w:rPr>
+          <w:b/>
+          <w:i w:val="0"/>
+          <w:color w:val="172B4D"/>
+          <w:sz w:val="21"/>
+        </w:rPr>
+        <w:t>executive register</w:t>
+      </w:r>
+      <w:r>
+        <w:rPr>
+          <w:b w:val="0"/>
+          <w:i w:val="0"/>
+          <w:color w:val="172B4D"/>
+          <w:sz w:val="21"/>
+        </w:rPr>
+        <w:t xml:space="preserve"> (outcome + risk, no code identifiers); the developer detail lives on the pages that follow.</w:t>
+      </w:r>
+    </w:p>
+    <w:p>
+      <w:pPr>
         <w:spacing w:before="280" w:after="80"/>
         <w:pBdr>
           <w:bottom w:val="single" w:sz="6" w:space="1" w:color="DFE1E6"/>
@@ -6808,12 +7712,21 @@
       </w:pPr>
       <w:r>
         <w:rPr>
-          <w:b w:val="0"/>
-          <w:i w:val="0"/>
-          <w:color w:val="172B4D"/>
-          <w:sz w:val="21"/>
-        </w:rPr>
-        <w:t>The solution document (</w:t>
+          <w:b/>
+          <w:i w:val="0"/>
+          <w:color w:val="172B4D"/>
+          <w:sz w:val="21"/>
+        </w:rPr>
+        <w:t>Published as a GitHub template repo</w:t>
+      </w:r>
+      <w:r>
+        <w:rPr>
+          <w:b w:val="0"/>
+          <w:i w:val="0"/>
+          <w:color w:val="172B4D"/>
+          <w:sz w:val="21"/>
+        </w:rPr>
+        <w:t xml:space="preserve"> (</w:t>
       </w:r>
       <w:r>
         <w:rPr>
@@ -6824,7 +7737,161 @@
           <w:sz w:val="19"/>
           <w:shd w:val="clear" w:fill="F4F5F7"/>
         </w:rPr>
-        <w:t>docs/solution.html</w:t>
+        <w:t>314495_ai-ops-harness-swat</w:t>
+      </w:r>
+      <w:r>
+        <w:rPr>
+          <w:b w:val="0"/>
+          <w:i w:val="0"/>
+          <w:color w:val="172B4D"/>
+          <w:sz w:val="21"/>
+        </w:rPr>
+        <w:t>) with the</w:t>
+      </w:r>
+    </w:p>
+    <w:p>
+      <w:pPr>
+        <w:spacing w:after="120"/>
+      </w:pPr>
+      <w:r>
+        <w:rPr>
+          <w:b w:val="0"/>
+          <w:i w:val="0"/>
+          <w:color w:val="172B4D"/>
+          <w:sz w:val="21"/>
+        </w:rPr>
+        <w:t xml:space="preserve">two-README model + Step 0 promotion; dev boilerplate and the </w:t>
+      </w:r>
+      <w:r>
+        <w:rPr>
+          <w:rFonts w:ascii="Consolas" w:hAnsi="Consolas"/>
+          <w:b w:val="0"/>
+          <w:i w:val="0"/>
+          <w:color w:val="40302A"/>
+          <w:sz w:val="19"/>
+          <w:shd w:val="clear" w:fill="F4F5F7"/>
+        </w:rPr>
+        <w:t>arena</w:t>
+      </w:r>
+      <w:r>
+        <w:rPr>
+          <w:b w:val="0"/>
+          <w:i w:val="0"/>
+          <w:color w:val="172B4D"/>
+          <w:sz w:val="21"/>
+        </w:rPr>
+        <w:t xml:space="preserve"> mirror kept in sync.</w:t>
+      </w:r>
+    </w:p>
+    <w:p>
+      <w:pPr>
+        <w:pStyle w:val="ListBullet"/>
+        <w:spacing w:after="20"/>
+      </w:pPr>
+      <w:r>
+        <w:rPr>
+          <w:b w:val="0"/>
+          <w:i w:val="0"/>
+          <w:color w:val="172B4D"/>
+          <w:sz w:val="21"/>
+        </w:rPr>
+        <w:t xml:space="preserve">The documentation set under </w:t>
+      </w:r>
+      <w:r>
+        <w:rPr>
+          <w:rFonts w:ascii="Consolas" w:hAnsi="Consolas"/>
+          <w:b w:val="0"/>
+          <w:i w:val="0"/>
+          <w:color w:val="40302A"/>
+          <w:sz w:val="19"/>
+          <w:shd w:val="clear" w:fill="F4F5F7"/>
+        </w:rPr>
+        <w:t>docs/_harness/</w:t>
+      </w:r>
+      <w:r>
+        <w:rPr>
+          <w:b w:val="0"/>
+          <w:i w:val="0"/>
+          <w:color w:val="172B4D"/>
+          <w:sz w:val="21"/>
+        </w:rPr>
+        <w:t xml:space="preserve">: the </w:t>
+      </w:r>
+      <w:r>
+        <w:rPr>
+          <w:rFonts w:ascii="Consolas" w:hAnsi="Consolas"/>
+          <w:b w:val="0"/>
+          <w:i w:val="0"/>
+          <w:color w:val="40302A"/>
+          <w:sz w:val="19"/>
+          <w:shd w:val="clear" w:fill="F4F5F7"/>
+        </w:rPr>
+        <w:t>solution.html</w:t>
+      </w:r>
+      <w:r>
+        <w:rPr>
+          <w:b w:val="0"/>
+          <w:i w:val="0"/>
+          <w:color w:val="172B4D"/>
+          <w:sz w:val="21"/>
+        </w:rPr>
+        <w:t xml:space="preserve"> and </w:t>
+      </w:r>
+      <w:r>
+        <w:rPr>
+          <w:rFonts w:ascii="Consolas" w:hAnsi="Consolas"/>
+          <w:b w:val="0"/>
+          <w:i w:val="0"/>
+          <w:color w:val="40302A"/>
+          <w:sz w:val="19"/>
+          <w:shd w:val="clear" w:fill="F4F5F7"/>
+        </w:rPr>
+        <w:t>ai-ops-harness.html</w:t>
+      </w:r>
+    </w:p>
+    <w:p>
+      <w:pPr>
+        <w:spacing w:after="120"/>
+      </w:pPr>
+      <w:r>
+        <w:rPr>
+          <w:b w:val="0"/>
+          <w:i w:val="0"/>
+          <w:color w:val="172B4D"/>
+          <w:sz w:val="21"/>
+        </w:rPr>
+        <w:t xml:space="preserve">solution docs, the </w:t>
+      </w:r>
+      <w:r>
+        <w:rPr>
+          <w:rFonts w:ascii="Consolas" w:hAnsi="Consolas"/>
+          <w:b w:val="0"/>
+          <w:i w:val="0"/>
+          <w:color w:val="40302A"/>
+          <w:sz w:val="19"/>
+          <w:shd w:val="clear" w:fill="F4F5F7"/>
+        </w:rPr>
+        <w:t>CAPABILITIES.md</w:t>
+      </w:r>
+      <w:r>
+        <w:rPr>
+          <w:b w:val="0"/>
+          <w:i w:val="0"/>
+          <w:color w:val="172B4D"/>
+          <w:sz w:val="21"/>
+        </w:rPr>
+        <w:t xml:space="preserve"> catalogue, and this design journal (Markdown + a coupled HTML + a Confluence-style </w:t>
+      </w:r>
+      <w:r>
+        <w:rPr>
+          <w:rFonts w:ascii="Consolas" w:hAnsi="Consolas"/>
+          <w:b w:val="0"/>
+          <w:i w:val="0"/>
+          <w:color w:val="40302A"/>
+          <w:sz w:val="19"/>
+          <w:shd w:val="clear" w:fill="F4F5F7"/>
+        </w:rPr>
+        <w:t>.docx</w:t>
       </w:r>
       <w:r>
         <w:rPr>

</xml_diff>